<commit_message>
updated the word docs
</commit_message>
<xml_diff>
--- a/Mirantis POC.docx
+++ b/Mirantis POC.docx
@@ -17149,12 +17149,91 @@
     </w:p>
     <w:p>
       <w:pPr>
+        <w:pStyle w:val="Heading2"/>
+      </w:pPr>
+      <w:r>
+        <w:t xml:space="preserve">Demo 1 – </w:t>
+      </w:r>
+      <w:r>
+        <w:t>Getting Started with Mirantis k0s on EC2</w:t>
+      </w:r>
+      <w:r>
+        <w:t xml:space="preserve"> </w:t>
+      </w:r>
+    </w:p>
+    <w:p>
+      <w:pPr>
         <w:jc w:val="both"/>
       </w:pPr>
+      <w:r>
+        <w:t>A compact, step-by-step guide to provision AWS EC2 instances, install and configure Mirantis k0s, and validate a lightweight Kubernetes cluster for development or edge deployments.</w:t>
+      </w:r>
+    </w:p>
+    <w:p>
+      <w:pPr>
+        <w:jc w:val="both"/>
+      </w:pPr>
+      <w:r>
+        <w:t xml:space="preserve">Repo - </w:t>
+      </w:r>
+      <w:hyperlink r:id="rId21" w:history="1">
+        <w:r>
+          <w:rPr>
+            <w:rStyle w:val="Hyperlink"/>
+          </w:rPr>
+          <w:t>https://github.com/tharinduk001/Getting-Started-with-Mirantis-k0s-on-EC2-</w:t>
+        </w:r>
+      </w:hyperlink>
+    </w:p>
+    <w:p>
+      <w:pPr>
+        <w:jc w:val="both"/>
+      </w:pPr>
+    </w:p>
+    <w:p>
+      <w:pPr>
+        <w:pStyle w:val="Heading2"/>
+      </w:pPr>
+      <w:r>
+        <w:lastRenderedPageBreak/>
+        <w:t>Demo 2 – Basic K8s Operations Test on k0s</w:t>
+      </w:r>
+    </w:p>
+    <w:p>
+      <w:pPr>
+        <w:jc w:val="both"/>
+      </w:pPr>
+      <w:r>
+        <w:t xml:space="preserve">We check the k8s self-healing, auto scaling capabilities are still </w:t>
+      </w:r>
+      <w:proofErr w:type="gramStart"/>
+      <w:r>
+        <w:t>works</w:t>
+      </w:r>
+      <w:proofErr w:type="gramEnd"/>
+      <w:r>
+        <w:t xml:space="preserve"> on k0s. </w:t>
+      </w:r>
+    </w:p>
+    <w:p>
+      <w:pPr>
+        <w:jc w:val="both"/>
+      </w:pPr>
+      <w:r>
+        <w:t xml:space="preserve">Repo - </w:t>
+      </w:r>
+      <w:hyperlink r:id="rId22" w:history="1">
+        <w:r>
+          <w:rPr>
+            <w:rStyle w:val="Hyperlink"/>
+          </w:rPr>
+          <w:t>https://github.com/tharinduk001/Getting-Started-with-Mirantis-k0s-on-EC2-</w:t>
+        </w:r>
+      </w:hyperlink>
     </w:p>
     <w:sectPr>
-      <w:headerReference w:type="default" r:id="rId21"/>
-      <w:footerReference w:type="default" r:id="rId22"/>
+      <w:headerReference w:type="default" r:id="rId23"/>
+      <w:footerReference w:type="default" r:id="rId24"/>
       <w:pgSz w:w="12240" w:h="15840"/>
       <w:pgMar w:top="1440" w:right="1440" w:bottom="1440" w:left="1440" w:header="720" w:footer="720" w:gutter="0"/>
       <w:cols w:space="720"/>

</xml_diff>

<commit_message>
Update Mirantis POC document to include additional demo information
</commit_message>
<xml_diff>
--- a/Mirantis POC.docx
+++ b/Mirantis POC.docx
@@ -17230,6 +17230,16 @@
           <w:t>https://github.com/tharinduk001/Getting-Started-with-Mirantis-k0s-on-EC2-</w:t>
         </w:r>
       </w:hyperlink>
+    </w:p>
+    <w:p>
+      <w:pPr>
+        <w:jc w:val="both"/>
+      </w:pPr>
+    </w:p>
+    <w:p>
+      <w:pPr>
+        <w:jc w:val="both"/>
+      </w:pPr>
     </w:p>
     <w:sectPr>
       <w:headerReference w:type="default" r:id="rId23"/>

</xml_diff>